<commit_message>
Agregué htmlcss gitygithub cuestionarios
</commit_message>
<xml_diff>
--- a/Auyda.docx
+++ b/Auyda.docx
@@ -637,7 +637,495 @@
         <w:t>y el flujo completo de inicio/cierre de sesión.</w:t>
       </w:r>
     </w:p>
+    <w:p>
+      <w:pPr>
+        <w:pStyle w:val="Prrafodelista"/>
+        <w:numPr>
+          <w:ilvl w:val="0"/>
+          <w:numId w:val="2"/>
+        </w:numPr>
+        <w:spacing w:before="100" w:beforeAutospacing="1" w:after="100" w:afterAutospacing="1" w:line="240" w:lineRule="auto"/>
+        <w:outlineLvl w:val="0"/>
+        <w:rPr>
+          <w:rFonts w:ascii="Times New Roman" w:eastAsia="Times New Roman" w:hAnsi="Times New Roman" w:cs="Times New Roman"/>
+          <w:b/>
+          <w:bCs/>
+          <w:kern w:val="36"/>
+          <w:sz w:val="48"/>
+          <w:szCs w:val="48"/>
+          <w:lang w:eastAsia="es-ES"/>
+          <w14:ligatures w14:val="none"/>
+        </w:rPr>
+      </w:pPr>
+      <w:r>
+        <w:rPr>
+          <w:rFonts w:ascii="Times New Roman" w:eastAsia="Times New Roman" w:hAnsi="Times New Roman" w:cs="Times New Roman"/>
+          <w:b/>
+          <w:bCs/>
+          <w:kern w:val="36"/>
+          <w:sz w:val="48"/>
+          <w:szCs w:val="48"/>
+          <w:lang w:eastAsia="es-ES"/>
+          <w14:ligatures w14:val="none"/>
+        </w:rPr>
+        <w:t>Lo haremos por etapas</w:t>
+      </w:r>
+    </w:p>
+    <w:p>
+      <w:pPr>
+        <w:pStyle w:val="Prrafodelista"/>
+        <w:numPr>
+          <w:ilvl w:val="0"/>
+          <w:numId w:val="2"/>
+        </w:numPr>
+        <w:spacing w:before="100" w:beforeAutospacing="1" w:after="100" w:afterAutospacing="1" w:line="240" w:lineRule="auto"/>
+        <w:outlineLvl w:val="1"/>
+        <w:rPr>
+          <w:rFonts w:ascii="Times New Roman" w:eastAsia="Times New Roman" w:hAnsi="Times New Roman" w:cs="Times New Roman"/>
+          <w:b/>
+          <w:bCs/>
+          <w:kern w:val="0"/>
+          <w:sz w:val="36"/>
+          <w:szCs w:val="36"/>
+          <w:lang w:eastAsia="es-ES"/>
+          <w14:ligatures w14:val="none"/>
+        </w:rPr>
+      </w:pPr>
+      <w:r>
+        <w:rPr>
+          <w:rFonts w:ascii="Times New Roman" w:eastAsia="Times New Roman" w:hAnsi="Times New Roman" w:cs="Times New Roman"/>
+          <w:b/>
+          <w:bCs/>
+          <w:kern w:val="0"/>
+          <w:sz w:val="36"/>
+          <w:szCs w:val="36"/>
+          <w:lang w:eastAsia="es-ES"/>
+          <w14:ligatures w14:val="none"/>
+        </w:rPr>
+        <w:t>Etapa 1 (hoy)</w:t>
+      </w:r>
+    </w:p>
+    <w:p>
+      <w:pPr>
+        <w:pStyle w:val="Prrafodelista"/>
+        <w:numPr>
+          <w:ilvl w:val="0"/>
+          <w:numId w:val="2"/>
+        </w:numPr>
+        <w:spacing w:before="100" w:beforeAutospacing="1" w:after="100" w:afterAutospacing="1" w:line="240" w:lineRule="auto"/>
+        <w:rPr>
+          <w:rFonts w:ascii="Times New Roman" w:eastAsia="Times New Roman" w:hAnsi="Times New Roman" w:cs="Times New Roman"/>
+          <w:kern w:val="0"/>
+          <w:lang w:eastAsia="es-ES"/>
+          <w14:ligatures w14:val="none"/>
+        </w:rPr>
+      </w:pPr>
+      <w:r>
+        <w:rPr>
+          <w:rFonts w:ascii="Times New Roman" w:eastAsia="Times New Roman" w:hAnsi="Times New Roman" w:cs="Times New Roman"/>
+          <w:kern w:val="0"/>
+          <w:lang w:eastAsia="es-ES"/>
+          <w14:ligatures w14:val="none"/>
+        </w:rPr>
+        <w:t xml:space="preserve">Crear un </w:t>
+      </w:r>
+      <w:proofErr w:type="spellStart"/>
+      <w:r>
+        <w:rPr>
+          <w:rFonts w:ascii="Times New Roman" w:eastAsia="Times New Roman" w:hAnsi="Times New Roman" w:cs="Times New Roman"/>
+          <w:kern w:val="0"/>
+          <w:lang w:eastAsia="es-ES"/>
+          <w14:ligatures w14:val="none"/>
+        </w:rPr>
+        <w:t>login</w:t>
+      </w:r>
+      <w:proofErr w:type="spellEnd"/>
+      <w:r>
+        <w:rPr>
+          <w:rFonts w:ascii="Times New Roman" w:eastAsia="Times New Roman" w:hAnsi="Times New Roman" w:cs="Times New Roman"/>
+          <w:kern w:val="0"/>
+          <w:lang w:eastAsia="es-ES"/>
+          <w14:ligatures w14:val="none"/>
+        </w:rPr>
+        <w:t xml:space="preserve"> moderno.</w:t>
+      </w:r>
+    </w:p>
+    <w:p>
+      <w:pPr>
+        <w:pStyle w:val="Prrafodelista"/>
+        <w:numPr>
+          <w:ilvl w:val="0"/>
+          <w:numId w:val="2"/>
+        </w:numPr>
+        <w:spacing w:before="100" w:beforeAutospacing="1" w:after="100" w:afterAutospacing="1" w:line="240" w:lineRule="auto"/>
+        <w:outlineLvl w:val="1"/>
+        <w:rPr>
+          <w:rFonts w:ascii="Times New Roman" w:eastAsia="Times New Roman" w:hAnsi="Times New Roman" w:cs="Times New Roman"/>
+          <w:b/>
+          <w:bCs/>
+          <w:kern w:val="0"/>
+          <w:sz w:val="36"/>
+          <w:szCs w:val="36"/>
+          <w:lang w:eastAsia="es-ES"/>
+          <w14:ligatures w14:val="none"/>
+        </w:rPr>
+      </w:pPr>
+      <w:r>
+        <w:rPr>
+          <w:rFonts w:ascii="Times New Roman" w:eastAsia="Times New Roman" w:hAnsi="Times New Roman" w:cs="Times New Roman"/>
+          <w:b/>
+          <w:bCs/>
+          <w:kern w:val="0"/>
+          <w:sz w:val="36"/>
+          <w:szCs w:val="36"/>
+          <w:lang w:eastAsia="es-ES"/>
+          <w14:ligatures w14:val="none"/>
+        </w:rPr>
+        <w:t>Etapa 2</w:t>
+      </w:r>
+    </w:p>
+    <w:p>
+      <w:pPr>
+        <w:pStyle w:val="Prrafodelista"/>
+        <w:numPr>
+          <w:ilvl w:val="0"/>
+          <w:numId w:val="2"/>
+        </w:numPr>
+        <w:spacing w:before="100" w:beforeAutospacing="1" w:after="100" w:afterAutospacing="1" w:line="240" w:lineRule="auto"/>
+        <w:rPr>
+          <w:rFonts w:ascii="Times New Roman" w:eastAsia="Times New Roman" w:hAnsi="Times New Roman" w:cs="Times New Roman"/>
+          <w:kern w:val="0"/>
+          <w:lang w:eastAsia="es-ES"/>
+          <w14:ligatures w14:val="none"/>
+        </w:rPr>
+      </w:pPr>
+      <w:r>
+        <w:rPr>
+          <w:rFonts w:ascii="Times New Roman" w:eastAsia="Times New Roman" w:hAnsi="Times New Roman" w:cs="Times New Roman"/>
+          <w:kern w:val="0"/>
+          <w:lang w:eastAsia="es-ES"/>
+          <w14:ligatures w14:val="none"/>
+        </w:rPr>
+        <w:t xml:space="preserve">Mejorar </w:t>
+      </w:r>
+      <w:r>
+        <w:rPr>
+          <w:rFonts w:ascii="Courier New" w:eastAsia="Times New Roman" w:hAnsi="Courier New" w:cs="Courier New"/>
+          <w:kern w:val="0"/>
+          <w:sz w:val="20"/>
+          <w:szCs w:val="20"/>
+          <w:lang w:eastAsia="es-ES"/>
+          <w14:ligatures w14:val="none"/>
+        </w:rPr>
+        <w:t>base.html</w:t>
+      </w:r>
+      <w:r>
+        <w:rPr>
+          <w:rFonts w:ascii="Times New Roman" w:eastAsia="Times New Roman" w:hAnsi="Times New Roman" w:cs="Times New Roman"/>
+          <w:kern w:val="0"/>
+          <w:lang w:eastAsia="es-ES"/>
+          <w14:ligatures w14:val="none"/>
+        </w:rPr>
+        <w:t>.</w:t>
+      </w:r>
+    </w:p>
+    <w:p>
+      <w:pPr>
+        <w:pStyle w:val="Prrafodelista"/>
+        <w:numPr>
+          <w:ilvl w:val="0"/>
+          <w:numId w:val="2"/>
+        </w:numPr>
+        <w:spacing w:before="100" w:beforeAutospacing="1" w:after="100" w:afterAutospacing="1" w:line="240" w:lineRule="auto"/>
+        <w:outlineLvl w:val="1"/>
+        <w:rPr>
+          <w:rFonts w:ascii="Times New Roman" w:eastAsia="Times New Roman" w:hAnsi="Times New Roman" w:cs="Times New Roman"/>
+          <w:b/>
+          <w:bCs/>
+          <w:kern w:val="0"/>
+          <w:sz w:val="36"/>
+          <w:szCs w:val="36"/>
+          <w:lang w:eastAsia="es-ES"/>
+          <w14:ligatures w14:val="none"/>
+        </w:rPr>
+      </w:pPr>
+      <w:r>
+        <w:rPr>
+          <w:rFonts w:ascii="Times New Roman" w:eastAsia="Times New Roman" w:hAnsi="Times New Roman" w:cs="Times New Roman"/>
+          <w:b/>
+          <w:bCs/>
+          <w:kern w:val="0"/>
+          <w:sz w:val="36"/>
+          <w:szCs w:val="36"/>
+          <w:lang w:eastAsia="es-ES"/>
+          <w14:ligatures w14:val="none"/>
+        </w:rPr>
+        <w:t>Etapa 3</w:t>
+      </w:r>
+    </w:p>
+    <w:p>
+      <w:pPr>
+        <w:pStyle w:val="Prrafodelista"/>
+        <w:numPr>
+          <w:ilvl w:val="0"/>
+          <w:numId w:val="2"/>
+        </w:numPr>
+        <w:spacing w:before="100" w:beforeAutospacing="1" w:after="100" w:afterAutospacing="1" w:line="240" w:lineRule="auto"/>
+        <w:rPr>
+          <w:rFonts w:ascii="Times New Roman" w:eastAsia="Times New Roman" w:hAnsi="Times New Roman" w:cs="Times New Roman"/>
+          <w:kern w:val="0"/>
+          <w:lang w:eastAsia="es-ES"/>
+          <w14:ligatures w14:val="none"/>
+        </w:rPr>
+      </w:pPr>
+      <w:r>
+        <w:rPr>
+          <w:rFonts w:ascii="Times New Roman" w:eastAsia="Times New Roman" w:hAnsi="Times New Roman" w:cs="Times New Roman"/>
+          <w:kern w:val="0"/>
+          <w:lang w:eastAsia="es-ES"/>
+          <w14:ligatures w14:val="none"/>
+        </w:rPr>
+        <w:t>Crear un menú responsive con hamburguesa.</w:t>
+      </w:r>
+    </w:p>
+    <w:p>
+      <w:pPr>
+        <w:pStyle w:val="Prrafodelista"/>
+        <w:numPr>
+          <w:ilvl w:val="0"/>
+          <w:numId w:val="2"/>
+        </w:numPr>
+        <w:spacing w:before="100" w:beforeAutospacing="1" w:after="100" w:afterAutospacing="1" w:line="240" w:lineRule="auto"/>
+        <w:outlineLvl w:val="1"/>
+        <w:rPr>
+          <w:rFonts w:ascii="Times New Roman" w:eastAsia="Times New Roman" w:hAnsi="Times New Roman" w:cs="Times New Roman"/>
+          <w:b/>
+          <w:bCs/>
+          <w:kern w:val="0"/>
+          <w:sz w:val="36"/>
+          <w:szCs w:val="36"/>
+          <w:lang w:eastAsia="es-ES"/>
+          <w14:ligatures w14:val="none"/>
+        </w:rPr>
+      </w:pPr>
+      <w:r>
+        <w:rPr>
+          <w:rFonts w:ascii="Times New Roman" w:eastAsia="Times New Roman" w:hAnsi="Times New Roman" w:cs="Times New Roman"/>
+          <w:b/>
+          <w:bCs/>
+          <w:kern w:val="0"/>
+          <w:sz w:val="36"/>
+          <w:szCs w:val="36"/>
+          <w:lang w:eastAsia="es-ES"/>
+          <w14:ligatures w14:val="none"/>
+        </w:rPr>
+        <w:t>Etapa 4</w:t>
+      </w:r>
+    </w:p>
+    <w:p>
+      <w:pPr>
+        <w:pStyle w:val="Prrafodelista"/>
+        <w:numPr>
+          <w:ilvl w:val="0"/>
+          <w:numId w:val="2"/>
+        </w:numPr>
+        <w:spacing w:before="100" w:beforeAutospacing="1" w:after="100" w:afterAutospacing="1" w:line="240" w:lineRule="auto"/>
+        <w:rPr>
+          <w:rFonts w:ascii="Times New Roman" w:eastAsia="Times New Roman" w:hAnsi="Times New Roman" w:cs="Times New Roman"/>
+          <w:kern w:val="0"/>
+          <w:lang w:eastAsia="es-ES"/>
+          <w14:ligatures w14:val="none"/>
+        </w:rPr>
+      </w:pPr>
+      <w:r>
+        <w:rPr>
+          <w:rFonts w:ascii="Times New Roman" w:eastAsia="Times New Roman" w:hAnsi="Times New Roman" w:cs="Times New Roman"/>
+          <w:kern w:val="0"/>
+          <w:lang w:eastAsia="es-ES"/>
+          <w14:ligatures w14:val="none"/>
+        </w:rPr>
+        <w:t xml:space="preserve">Crear el </w:t>
+      </w:r>
+      <w:proofErr w:type="spellStart"/>
+      <w:r>
+        <w:rPr>
+          <w:rFonts w:ascii="Times New Roman" w:eastAsia="Times New Roman" w:hAnsi="Times New Roman" w:cs="Times New Roman"/>
+          <w:kern w:val="0"/>
+          <w:lang w:eastAsia="es-ES"/>
+          <w14:ligatures w14:val="none"/>
+        </w:rPr>
+        <w:t>Dashboard</w:t>
+      </w:r>
+      <w:proofErr w:type="spellEnd"/>
+      <w:r>
+        <w:rPr>
+          <w:rFonts w:ascii="Times New Roman" w:eastAsia="Times New Roman" w:hAnsi="Times New Roman" w:cs="Times New Roman"/>
+          <w:kern w:val="0"/>
+          <w:lang w:eastAsia="es-ES"/>
+          <w14:ligatures w14:val="none"/>
+        </w:rPr>
+        <w:t>.</w:t>
+      </w:r>
+    </w:p>
     <w:p/>
+    <w:p>
+      <w:pPr>
+        <w:rPr>
+          <w:b/>
+          <w:bCs/>
+        </w:rPr>
+      </w:pPr>
+      <w:r>
+        <w:rPr>
+          <w:b/>
+          <w:bCs/>
+        </w:rPr>
+        <w:t>Lo que necesito ver</w:t>
+      </w:r>
+    </w:p>
+    <w:p>
+      <w:r>
+        <w:t>Para decirte exactamente qué reemplazar, necesito ver dos archivos:</w:t>
+      </w:r>
+    </w:p>
+    <w:p>
+      <w:pPr>
+        <w:numPr>
+          <w:ilvl w:val="0"/>
+          <w:numId w:val="3"/>
+        </w:numPr>
+      </w:pPr>
+      <w:proofErr w:type="spellStart"/>
+      <w:r>
+        <w:rPr>
+          <w:b/>
+          <w:bCs/>
+        </w:rPr>
+        <w:t>educacion</w:t>
+      </w:r>
+      <w:proofErr w:type="spellEnd"/>
+      <w:r>
+        <w:rPr>
+          <w:b/>
+          <w:bCs/>
+        </w:rPr>
+        <w:t>/</w:t>
+      </w:r>
+      <w:proofErr w:type="spellStart"/>
+      <w:r>
+        <w:rPr>
+          <w:b/>
+          <w:bCs/>
+        </w:rPr>
+        <w:t>templates</w:t>
+      </w:r>
+      <w:proofErr w:type="spellEnd"/>
+      <w:r>
+        <w:rPr>
+          <w:b/>
+          <w:bCs/>
+        </w:rPr>
+        <w:t>/</w:t>
+      </w:r>
+      <w:proofErr w:type="spellStart"/>
+      <w:r>
+        <w:rPr>
+          <w:b/>
+          <w:bCs/>
+        </w:rPr>
+        <w:t>educacion</w:t>
+      </w:r>
+      <w:proofErr w:type="spellEnd"/>
+      <w:r>
+        <w:rPr>
+          <w:b/>
+          <w:bCs/>
+        </w:rPr>
+        <w:t>/inicio.html</w:t>
+      </w:r>
+      <w:r>
+        <w:t xml:space="preserve"> (completo). </w:t>
+      </w:r>
+    </w:p>
+    <w:p>
+      <w:pPr>
+        <w:numPr>
+          <w:ilvl w:val="0"/>
+          <w:numId w:val="3"/>
+        </w:numPr>
+      </w:pPr>
+      <w:r>
+        <w:rPr>
+          <w:b/>
+          <w:bCs/>
+        </w:rPr>
+        <w:t>usuarios/models.py</w:t>
+      </w:r>
+      <w:r>
+        <w:t xml:space="preserve"> (para ver cómo está definido tu modelo Usuario). </w:t>
+      </w:r>
+    </w:p>
+    <w:p>
+      <w:r>
+        <w:t>Con esos dos archivos te indicaré la forma correcta de mostrar:</w:t>
+      </w:r>
+    </w:p>
+    <w:p>
+      <w:pPr>
+        <w:numPr>
+          <w:ilvl w:val="0"/>
+          <w:numId w:val="4"/>
+        </w:numPr>
+      </w:pPr>
+      <w:r>
+        <w:t xml:space="preserve">el nombre completo, </w:t>
+      </w:r>
+    </w:p>
+    <w:p>
+      <w:pPr>
+        <w:numPr>
+          <w:ilvl w:val="0"/>
+          <w:numId w:val="4"/>
+        </w:numPr>
+      </w:pPr>
+      <w:r>
+        <w:t xml:space="preserve">el rol (Alumno, Docente, Administrador), </w:t>
+      </w:r>
+    </w:p>
+    <w:p>
+      <w:pPr>
+        <w:numPr>
+          <w:ilvl w:val="0"/>
+          <w:numId w:val="4"/>
+        </w:numPr>
+      </w:pPr>
+      <w:r>
+        <w:t xml:space="preserve">e incluso podremos agregar un saludo como: </w:t>
+      </w:r>
+    </w:p>
+    <w:p>
+      <w:r>
+        <w:rPr>
+          <w:rFonts w:ascii="Segoe UI Emoji" w:hAnsi="Segoe UI Emoji" w:cs="Segoe UI Emoji"/>
+        </w:rPr>
+        <w:t>👋</w:t>
+      </w:r>
+      <w:r>
+        <w:t xml:space="preserve"> </w:t>
+      </w:r>
+      <w:r>
+        <w:rPr>
+          <w:b/>
+          <w:bCs/>
+        </w:rPr>
+        <w:t>¡Buenos días, Luis! Bienvenido nuevamente.</w:t>
+      </w:r>
+    </w:p>
+    <w:p>
+      <w:r>
+        <w:t>aprovechando la información del usuario autenticado.</w:t>
+      </w:r>
+    </w:p>
     <w:p/>
     <w:sectPr>
       <w:pgSz w:w="11906" w:h="16838"/>
@@ -913,11 +1401,279 @@
       </w:pPr>
     </w:lvl>
   </w:abstractNum>
+  <w:abstractNum w:abstractNumId="2" w15:restartNumberingAfterBreak="0">
+    <w:nsid w:val="4F0F47C5"/>
+    <w:multiLevelType w:val="multilevel"/>
+    <w:tmpl w:val="2F34243E"/>
+    <w:lvl w:ilvl="0">
+      <w:start w:val="1"/>
+      <w:numFmt w:val="decimal"/>
+      <w:lvlText w:val="%1."/>
+      <w:lvlJc w:val="left"/>
+      <w:pPr>
+        <w:tabs>
+          <w:tab w:val="num" w:pos="720"/>
+        </w:tabs>
+        <w:ind w:left="720" w:hanging="360"/>
+      </w:pPr>
+    </w:lvl>
+    <w:lvl w:ilvl="1" w:tentative="1">
+      <w:start w:val="1"/>
+      <w:numFmt w:val="decimal"/>
+      <w:lvlText w:val="%2."/>
+      <w:lvlJc w:val="left"/>
+      <w:pPr>
+        <w:tabs>
+          <w:tab w:val="num" w:pos="1440"/>
+        </w:tabs>
+        <w:ind w:left="1440" w:hanging="360"/>
+      </w:pPr>
+    </w:lvl>
+    <w:lvl w:ilvl="2" w:tentative="1">
+      <w:start w:val="1"/>
+      <w:numFmt w:val="decimal"/>
+      <w:lvlText w:val="%3."/>
+      <w:lvlJc w:val="left"/>
+      <w:pPr>
+        <w:tabs>
+          <w:tab w:val="num" w:pos="2160"/>
+        </w:tabs>
+        <w:ind w:left="2160" w:hanging="360"/>
+      </w:pPr>
+    </w:lvl>
+    <w:lvl w:ilvl="3" w:tentative="1">
+      <w:start w:val="1"/>
+      <w:numFmt w:val="decimal"/>
+      <w:lvlText w:val="%4."/>
+      <w:lvlJc w:val="left"/>
+      <w:pPr>
+        <w:tabs>
+          <w:tab w:val="num" w:pos="2880"/>
+        </w:tabs>
+        <w:ind w:left="2880" w:hanging="360"/>
+      </w:pPr>
+    </w:lvl>
+    <w:lvl w:ilvl="4" w:tentative="1">
+      <w:start w:val="1"/>
+      <w:numFmt w:val="decimal"/>
+      <w:lvlText w:val="%5."/>
+      <w:lvlJc w:val="left"/>
+      <w:pPr>
+        <w:tabs>
+          <w:tab w:val="num" w:pos="3600"/>
+        </w:tabs>
+        <w:ind w:left="3600" w:hanging="360"/>
+      </w:pPr>
+    </w:lvl>
+    <w:lvl w:ilvl="5" w:tentative="1">
+      <w:start w:val="1"/>
+      <w:numFmt w:val="decimal"/>
+      <w:lvlText w:val="%6."/>
+      <w:lvlJc w:val="left"/>
+      <w:pPr>
+        <w:tabs>
+          <w:tab w:val="num" w:pos="4320"/>
+        </w:tabs>
+        <w:ind w:left="4320" w:hanging="360"/>
+      </w:pPr>
+    </w:lvl>
+    <w:lvl w:ilvl="6" w:tentative="1">
+      <w:start w:val="1"/>
+      <w:numFmt w:val="decimal"/>
+      <w:lvlText w:val="%7."/>
+      <w:lvlJc w:val="left"/>
+      <w:pPr>
+        <w:tabs>
+          <w:tab w:val="num" w:pos="5040"/>
+        </w:tabs>
+        <w:ind w:left="5040" w:hanging="360"/>
+      </w:pPr>
+    </w:lvl>
+    <w:lvl w:ilvl="7" w:tentative="1">
+      <w:start w:val="1"/>
+      <w:numFmt w:val="decimal"/>
+      <w:lvlText w:val="%8."/>
+      <w:lvlJc w:val="left"/>
+      <w:pPr>
+        <w:tabs>
+          <w:tab w:val="num" w:pos="5760"/>
+        </w:tabs>
+        <w:ind w:left="5760" w:hanging="360"/>
+      </w:pPr>
+    </w:lvl>
+    <w:lvl w:ilvl="8" w:tentative="1">
+      <w:start w:val="1"/>
+      <w:numFmt w:val="decimal"/>
+      <w:lvlText w:val="%9."/>
+      <w:lvlJc w:val="left"/>
+      <w:pPr>
+        <w:tabs>
+          <w:tab w:val="num" w:pos="6480"/>
+        </w:tabs>
+        <w:ind w:left="6480" w:hanging="360"/>
+      </w:pPr>
+    </w:lvl>
+  </w:abstractNum>
+  <w:abstractNum w:abstractNumId="3" w15:restartNumberingAfterBreak="0">
+    <w:nsid w:val="68BA72B7"/>
+    <w:multiLevelType w:val="multilevel"/>
+    <w:tmpl w:val="33E2DBAC"/>
+    <w:lvl w:ilvl="0">
+      <w:start w:val="1"/>
+      <w:numFmt w:val="bullet"/>
+      <w:lvlText w:val=""/>
+      <w:lvlJc w:val="left"/>
+      <w:pPr>
+        <w:tabs>
+          <w:tab w:val="num" w:pos="720"/>
+        </w:tabs>
+        <w:ind w:left="720" w:hanging="360"/>
+      </w:pPr>
+      <w:rPr>
+        <w:rFonts w:ascii="Symbol" w:hAnsi="Symbol" w:hint="default"/>
+        <w:sz w:val="20"/>
+      </w:rPr>
+    </w:lvl>
+    <w:lvl w:ilvl="1" w:tentative="1">
+      <w:start w:val="1"/>
+      <w:numFmt w:val="bullet"/>
+      <w:lvlText w:val="o"/>
+      <w:lvlJc w:val="left"/>
+      <w:pPr>
+        <w:tabs>
+          <w:tab w:val="num" w:pos="1440"/>
+        </w:tabs>
+        <w:ind w:left="1440" w:hanging="360"/>
+      </w:pPr>
+      <w:rPr>
+        <w:rFonts w:ascii="Courier New" w:hAnsi="Courier New" w:hint="default"/>
+        <w:sz w:val="20"/>
+      </w:rPr>
+    </w:lvl>
+    <w:lvl w:ilvl="2" w:tentative="1">
+      <w:start w:val="1"/>
+      <w:numFmt w:val="bullet"/>
+      <w:lvlText w:val=""/>
+      <w:lvlJc w:val="left"/>
+      <w:pPr>
+        <w:tabs>
+          <w:tab w:val="num" w:pos="2160"/>
+        </w:tabs>
+        <w:ind w:left="2160" w:hanging="360"/>
+      </w:pPr>
+      <w:rPr>
+        <w:rFonts w:ascii="Wingdings" w:hAnsi="Wingdings" w:hint="default"/>
+        <w:sz w:val="20"/>
+      </w:rPr>
+    </w:lvl>
+    <w:lvl w:ilvl="3" w:tentative="1">
+      <w:start w:val="1"/>
+      <w:numFmt w:val="bullet"/>
+      <w:lvlText w:val=""/>
+      <w:lvlJc w:val="left"/>
+      <w:pPr>
+        <w:tabs>
+          <w:tab w:val="num" w:pos="2880"/>
+        </w:tabs>
+        <w:ind w:left="2880" w:hanging="360"/>
+      </w:pPr>
+      <w:rPr>
+        <w:rFonts w:ascii="Wingdings" w:hAnsi="Wingdings" w:hint="default"/>
+        <w:sz w:val="20"/>
+      </w:rPr>
+    </w:lvl>
+    <w:lvl w:ilvl="4" w:tentative="1">
+      <w:start w:val="1"/>
+      <w:numFmt w:val="bullet"/>
+      <w:lvlText w:val=""/>
+      <w:lvlJc w:val="left"/>
+      <w:pPr>
+        <w:tabs>
+          <w:tab w:val="num" w:pos="3600"/>
+        </w:tabs>
+        <w:ind w:left="3600" w:hanging="360"/>
+      </w:pPr>
+      <w:rPr>
+        <w:rFonts w:ascii="Wingdings" w:hAnsi="Wingdings" w:hint="default"/>
+        <w:sz w:val="20"/>
+      </w:rPr>
+    </w:lvl>
+    <w:lvl w:ilvl="5" w:tentative="1">
+      <w:start w:val="1"/>
+      <w:numFmt w:val="bullet"/>
+      <w:lvlText w:val=""/>
+      <w:lvlJc w:val="left"/>
+      <w:pPr>
+        <w:tabs>
+          <w:tab w:val="num" w:pos="4320"/>
+        </w:tabs>
+        <w:ind w:left="4320" w:hanging="360"/>
+      </w:pPr>
+      <w:rPr>
+        <w:rFonts w:ascii="Wingdings" w:hAnsi="Wingdings" w:hint="default"/>
+        <w:sz w:val="20"/>
+      </w:rPr>
+    </w:lvl>
+    <w:lvl w:ilvl="6" w:tentative="1">
+      <w:start w:val="1"/>
+      <w:numFmt w:val="bullet"/>
+      <w:lvlText w:val=""/>
+      <w:lvlJc w:val="left"/>
+      <w:pPr>
+        <w:tabs>
+          <w:tab w:val="num" w:pos="5040"/>
+        </w:tabs>
+        <w:ind w:left="5040" w:hanging="360"/>
+      </w:pPr>
+      <w:rPr>
+        <w:rFonts w:ascii="Wingdings" w:hAnsi="Wingdings" w:hint="default"/>
+        <w:sz w:val="20"/>
+      </w:rPr>
+    </w:lvl>
+    <w:lvl w:ilvl="7" w:tentative="1">
+      <w:start w:val="1"/>
+      <w:numFmt w:val="bullet"/>
+      <w:lvlText w:val=""/>
+      <w:lvlJc w:val="left"/>
+      <w:pPr>
+        <w:tabs>
+          <w:tab w:val="num" w:pos="5760"/>
+        </w:tabs>
+        <w:ind w:left="5760" w:hanging="360"/>
+      </w:pPr>
+      <w:rPr>
+        <w:rFonts w:ascii="Wingdings" w:hAnsi="Wingdings" w:hint="default"/>
+        <w:sz w:val="20"/>
+      </w:rPr>
+    </w:lvl>
+    <w:lvl w:ilvl="8" w:tentative="1">
+      <w:start w:val="1"/>
+      <w:numFmt w:val="bullet"/>
+      <w:lvlText w:val=""/>
+      <w:lvlJc w:val="left"/>
+      <w:pPr>
+        <w:tabs>
+          <w:tab w:val="num" w:pos="6480"/>
+        </w:tabs>
+        <w:ind w:left="6480" w:hanging="360"/>
+      </w:pPr>
+      <w:rPr>
+        <w:rFonts w:ascii="Wingdings" w:hAnsi="Wingdings" w:hint="default"/>
+        <w:sz w:val="20"/>
+      </w:rPr>
+    </w:lvl>
+  </w:abstractNum>
   <w:num w:numId="1" w16cid:durableId="26876345">
     <w:abstractNumId w:val="1"/>
   </w:num>
   <w:num w:numId="2" w16cid:durableId="1732728819">
     <w:abstractNumId w:val="0"/>
+  </w:num>
+  <w:num w:numId="3" w16cid:durableId="1513833518">
+    <w:abstractNumId w:val="2"/>
+  </w:num>
+  <w:num w:numId="4" w16cid:durableId="1728603939">
+    <w:abstractNumId w:val="3"/>
   </w:num>
 </w:numbering>
 </file>
@@ -1350,7 +2106,6 @@
     <w:next w:val="Normal"/>
     <w:link w:val="Ttulo2Car"/>
     <w:uiPriority w:val="9"/>
-    <w:semiHidden/>
     <w:unhideWhenUsed/>
     <w:qFormat/>
     <w:rsid w:val="00DD3B88"/>
@@ -1566,7 +2321,6 @@
     <w:basedOn w:val="Fuentedeprrafopredeter"/>
     <w:link w:val="Ttulo2"/>
     <w:uiPriority w:val="9"/>
-    <w:semiHidden/>
     <w:rsid w:val="00DD3B88"/>
     <w:rPr>
       <w:rFonts w:asciiTheme="majorHAnsi" w:eastAsiaTheme="majorEastAsia" w:hAnsiTheme="majorHAnsi" w:cstheme="majorBidi"/>
@@ -1836,6 +2590,36 @@
       <w:smallCaps/>
       <w:color w:val="2F5496" w:themeColor="accent1" w:themeShade="BF"/>
       <w:spacing w:val="5"/>
+    </w:rPr>
+  </w:style>
+  <w:style w:type="paragraph" w:styleId="NormalWeb">
+    <w:name w:val="Normal (Web)"/>
+    <w:basedOn w:val="Normal"/>
+    <w:uiPriority w:val="99"/>
+    <w:semiHidden/>
+    <w:unhideWhenUsed/>
+    <w:rsid w:val="003E0805"/>
+    <w:pPr>
+      <w:spacing w:before="100" w:beforeAutospacing="1" w:after="100" w:afterAutospacing="1" w:line="240" w:lineRule="auto"/>
+    </w:pPr>
+    <w:rPr>
+      <w:rFonts w:ascii="Times New Roman" w:eastAsia="Times New Roman" w:hAnsi="Times New Roman" w:cs="Times New Roman"/>
+      <w:kern w:val="0"/>
+      <w:lang w:eastAsia="es-ES"/>
+      <w14:ligatures w14:val="none"/>
+    </w:rPr>
+  </w:style>
+  <w:style w:type="character" w:styleId="CdigoHTML">
+    <w:name w:val="HTML Code"/>
+    <w:basedOn w:val="Fuentedeprrafopredeter"/>
+    <w:uiPriority w:val="99"/>
+    <w:semiHidden/>
+    <w:unhideWhenUsed/>
+    <w:rsid w:val="003E0805"/>
+    <w:rPr>
+      <w:rFonts w:ascii="Courier New" w:eastAsia="Times New Roman" w:hAnsi="Courier New" w:cs="Courier New"/>
+      <w:sz w:val="20"/>
+      <w:szCs w:val="20"/>
     </w:rPr>
   </w:style>
 </w:styles>

</xml_diff>

<commit_message>
Agregué 6. Crear la Vista (contactos/views.py)
</commit_message>
<xml_diff>
--- a/Auyda.docx
+++ b/Auyda.docx
@@ -1122,8 +1122,675 @@
       </w:r>
     </w:p>
     <w:p>
+      <w:pPr>
+        <w:pBdr>
+          <w:bottom w:val="single" w:sz="6" w:space="1" w:color="auto"/>
+        </w:pBdr>
+      </w:pPr>
       <w:r>
         <w:t>aprovechando la información del usuario autenticado.</w:t>
+      </w:r>
+    </w:p>
+    <w:p>
+      <w:r>
+        <w:t xml:space="preserve">Importante para hacer copia de lo ingresado en la base de datos a </w:t>
+      </w:r>
+      <w:proofErr w:type="spellStart"/>
+      <w:r>
+        <w:t>github</w:t>
+      </w:r>
+      <w:proofErr w:type="spellEnd"/>
+      <w:r>
+        <w:t>:</w:t>
+      </w:r>
+    </w:p>
+    <w:p>
+      <w:r>
+        <w:t xml:space="preserve">¡Tal cual! Ahí lo tienes en el bloque de </w:t>
+      </w:r>
+      <w:r>
+        <w:rPr>
+          <w:b/>
+          <w:bCs/>
+        </w:rPr>
+        <w:t xml:space="preserve">Django &amp; Local </w:t>
+      </w:r>
+      <w:proofErr w:type="spellStart"/>
+      <w:r>
+        <w:rPr>
+          <w:b/>
+          <w:bCs/>
+        </w:rPr>
+        <w:t>Database</w:t>
+      </w:r>
+      <w:proofErr w:type="spellEnd"/>
+      <w:r>
+        <w:rPr>
+          <w:b/>
+          <w:bCs/>
+        </w:rPr>
+        <w:t xml:space="preserve"> files</w:t>
+      </w:r>
+      <w:r>
+        <w:t>:</w:t>
+      </w:r>
+    </w:p>
+    <w:p>
+      <w:r>
+        <w:t>Fragmento de código</w:t>
+      </w:r>
+    </w:p>
+    <w:p>
+      <w:r>
+        <w:lastRenderedPageBreak/>
+        <w:t># ==========================================</w:t>
+      </w:r>
+    </w:p>
+    <w:p>
+      <w:r>
+        <w:t xml:space="preserve"># Django &amp; Local </w:t>
+      </w:r>
+      <w:proofErr w:type="spellStart"/>
+      <w:r>
+        <w:t>Database</w:t>
+      </w:r>
+      <w:proofErr w:type="spellEnd"/>
+      <w:r>
+        <w:t xml:space="preserve"> files</w:t>
+      </w:r>
+    </w:p>
+    <w:p>
+      <w:pPr>
+        <w:rPr>
+          <w:lang w:val="en-US"/>
+        </w:rPr>
+      </w:pPr>
+      <w:r>
+        <w:rPr>
+          <w:lang w:val="en-US"/>
+        </w:rPr>
+        <w:t># ==========================================</w:t>
+      </w:r>
+    </w:p>
+    <w:p>
+      <w:pPr>
+        <w:rPr>
+          <w:lang w:val="en-US"/>
+        </w:rPr>
+      </w:pPr>
+      <w:r>
+        <w:rPr>
+          <w:lang w:val="en-US"/>
+        </w:rPr>
+        <w:t>*.sqlite3</w:t>
+      </w:r>
+    </w:p>
+    <w:p>
+      <w:pPr>
+        <w:rPr>
+          <w:lang w:val="en-US"/>
+        </w:rPr>
+      </w:pPr>
+      <w:r>
+        <w:rPr>
+          <w:lang w:val="en-US"/>
+        </w:rPr>
+        <w:t>*.sqlite3-journal</w:t>
+      </w:r>
+    </w:p>
+    <w:p>
+      <w:pPr>
+        <w:rPr>
+          <w:lang w:val="en-US"/>
+        </w:rPr>
+      </w:pPr>
+      <w:r>
+        <w:rPr>
+          <w:lang w:val="en-US"/>
+        </w:rPr>
+        <w:t>db.sqlite3</w:t>
+      </w:r>
+    </w:p>
+    <w:p>
+      <w:pPr>
+        <w:rPr>
+          <w:lang w:val="en-US"/>
+        </w:rPr>
+      </w:pPr>
+      <w:r>
+        <w:rPr>
+          <w:lang w:val="en-US"/>
+        </w:rPr>
+        <w:t>db.sqlite3-shm</w:t>
+      </w:r>
+    </w:p>
+    <w:p>
+      <w:r>
+        <w:t>db.sqlite3-wal</w:t>
+      </w:r>
+    </w:p>
+    <w:p>
+      <w:r>
+        <w:t>Es por la regla db.sqlite3 (y *.sqlite3) que Git está ignorando tu base de datos y por eso te dice que no hay cambios para guardar.</w:t>
+      </w:r>
+    </w:p>
+    <w:p>
+      <w:pPr>
+        <w:rPr>
+          <w:b/>
+          <w:bCs/>
+        </w:rPr>
+      </w:pPr>
+      <w:r>
+        <w:rPr>
+          <w:b/>
+          <w:bCs/>
+        </w:rPr>
+        <w:t xml:space="preserve">¿Cómo proceder ahora? </w:t>
+      </w:r>
+      <w:proofErr w:type="spellStart"/>
+      <w:r>
+        <w:rPr>
+          <w:b/>
+          <w:bCs/>
+        </w:rPr>
+        <w:t>Tenés</w:t>
+      </w:r>
+      <w:proofErr w:type="spellEnd"/>
+      <w:r>
+        <w:rPr>
+          <w:b/>
+          <w:bCs/>
+        </w:rPr>
+        <w:t xml:space="preserve"> 2 alternativas sencillas:</w:t>
+      </w:r>
+    </w:p>
+    <w:p>
+      <w:pPr>
+        <w:rPr>
+          <w:b/>
+          <w:bCs/>
+        </w:rPr>
+      </w:pPr>
+      <w:r>
+        <w:rPr>
+          <w:b/>
+          <w:bCs/>
+        </w:rPr>
+        <w:t>Opción 1: Queres guardar la Base de Datos en Git (La más directa)</w:t>
+      </w:r>
+    </w:p>
+    <w:p>
+      <w:r>
+        <w:t xml:space="preserve">Si lo que cargaste en el Admin </w:t>
+      </w:r>
+      <w:proofErr w:type="spellStart"/>
+      <w:r>
+        <w:t>querés</w:t>
+      </w:r>
+      <w:proofErr w:type="spellEnd"/>
+      <w:r>
+        <w:t xml:space="preserve"> que sí o sí quede guardado en tu repositorio Git (para no perder el contenido al cambiar de PC), </w:t>
+      </w:r>
+      <w:proofErr w:type="spellStart"/>
+      <w:r>
+        <w:t>podés</w:t>
+      </w:r>
+      <w:proofErr w:type="spellEnd"/>
+      <w:r>
+        <w:t xml:space="preserve"> indicarle a Git que haga una excepción.</w:t>
+      </w:r>
+    </w:p>
+    <w:p>
+      <w:pPr>
+        <w:numPr>
+          <w:ilvl w:val="0"/>
+          <w:numId w:val="5"/>
+        </w:numPr>
+      </w:pPr>
+      <w:r>
+        <w:t xml:space="preserve">Abre la terminal y ejecuta este comando para forzar que Git agregue la base de datos a pesar </w:t>
+      </w:r>
+      <w:proofErr w:type="gramStart"/>
+      <w:r>
+        <w:t>del .</w:t>
+      </w:r>
+      <w:proofErr w:type="spellStart"/>
+      <w:r>
+        <w:t>gitignore</w:t>
+      </w:r>
+      <w:proofErr w:type="spellEnd"/>
+      <w:proofErr w:type="gramEnd"/>
+      <w:r>
+        <w:t>:</w:t>
+      </w:r>
+    </w:p>
+    <w:p>
+      <w:pPr>
+        <w:rPr>
+          <w:lang w:val="en-US"/>
+        </w:rPr>
+      </w:pPr>
+      <w:r>
+        <w:rPr>
+          <w:lang w:val="en-US"/>
+        </w:rPr>
+        <w:t>Bash</w:t>
+      </w:r>
+    </w:p>
+    <w:p>
+      <w:pPr>
+        <w:rPr>
+          <w:lang w:val="en-US"/>
+        </w:rPr>
+      </w:pPr>
+      <w:r>
+        <w:rPr>
+          <w:lang w:val="en-US"/>
+        </w:rPr>
+        <w:t>git add -f db.sqlite3</w:t>
+      </w:r>
+    </w:p>
+    <w:p>
+      <w:pPr>
+        <w:numPr>
+          <w:ilvl w:val="0"/>
+          <w:numId w:val="5"/>
+        </w:numPr>
+      </w:pPr>
+      <w:r>
+        <w:t xml:space="preserve">Hace el </w:t>
+      </w:r>
+      <w:proofErr w:type="spellStart"/>
+      <w:r>
+        <w:t>commit</w:t>
+      </w:r>
+      <w:proofErr w:type="spellEnd"/>
+      <w:r>
+        <w:t xml:space="preserve"> de los cambios:</w:t>
+      </w:r>
+    </w:p>
+    <w:p>
+      <w:r>
+        <w:t>Bash</w:t>
+      </w:r>
+    </w:p>
+    <w:p>
+      <w:proofErr w:type="spellStart"/>
+      <w:r>
+        <w:t>git</w:t>
+      </w:r>
+      <w:proofErr w:type="spellEnd"/>
+      <w:r>
+        <w:t xml:space="preserve"> </w:t>
+      </w:r>
+      <w:proofErr w:type="spellStart"/>
+      <w:r>
+        <w:t>commit</w:t>
+      </w:r>
+      <w:proofErr w:type="spellEnd"/>
+      <w:r>
+        <w:t xml:space="preserve"> -m "Agregado contenido de lecciones a la base de datos"</w:t>
+      </w:r>
+    </w:p>
+    <w:p>
+      <w:pPr>
+        <w:numPr>
+          <w:ilvl w:val="0"/>
+          <w:numId w:val="5"/>
+        </w:numPr>
+      </w:pPr>
+      <w:r>
+        <w:rPr>
+          <w:i/>
+          <w:iCs/>
+        </w:rPr>
+        <w:t>(Opcional)</w:t>
+      </w:r>
+      <w:r>
+        <w:t xml:space="preserve"> Si </w:t>
+      </w:r>
+      <w:proofErr w:type="spellStart"/>
+      <w:r>
+        <w:t>querés</w:t>
+      </w:r>
+      <w:proofErr w:type="spellEnd"/>
+      <w:r>
+        <w:t xml:space="preserve"> que de ahora en más </w:t>
+      </w:r>
+      <w:r>
+        <w:rPr>
+          <w:b/>
+          <w:bCs/>
+        </w:rPr>
+        <w:t>siempre</w:t>
+      </w:r>
+      <w:r>
+        <w:t xml:space="preserve"> </w:t>
+      </w:r>
+      <w:proofErr w:type="gramStart"/>
+      <w:r>
+        <w:t>rastree</w:t>
+      </w:r>
+      <w:proofErr w:type="gramEnd"/>
+      <w:r>
+        <w:t xml:space="preserve"> la base de datos sin usar el -f, abrí </w:t>
+      </w:r>
+      <w:proofErr w:type="spellStart"/>
+      <w:proofErr w:type="gramStart"/>
+      <w:r>
+        <w:t>el</w:t>
+      </w:r>
+      <w:proofErr w:type="spellEnd"/>
+      <w:r>
+        <w:t xml:space="preserve"> .</w:t>
+      </w:r>
+      <w:proofErr w:type="spellStart"/>
+      <w:r>
+        <w:t>gitignore</w:t>
+      </w:r>
+      <w:proofErr w:type="spellEnd"/>
+      <w:proofErr w:type="gramEnd"/>
+      <w:r>
+        <w:t xml:space="preserve"> y </w:t>
+      </w:r>
+      <w:proofErr w:type="spellStart"/>
+      <w:r>
+        <w:t>borrá</w:t>
+      </w:r>
+      <w:proofErr w:type="spellEnd"/>
+      <w:r>
+        <w:t xml:space="preserve"> la línea db.sqlite3 y *.sqlite3.</w:t>
+      </w:r>
+    </w:p>
+    <w:p>
+      <w:pPr>
+        <w:rPr>
+          <w:b/>
+          <w:bCs/>
+        </w:rPr>
+      </w:pPr>
+      <w:r>
+        <w:rPr>
+          <w:b/>
+          <w:bCs/>
+        </w:rPr>
+        <w:t>Opción 2: Respaldar las lecciones sin subir la Base de Datos (Buena práctica)</w:t>
+      </w:r>
+    </w:p>
+    <w:p>
+      <w:r>
+        <w:t xml:space="preserve">Si </w:t>
+      </w:r>
+      <w:proofErr w:type="spellStart"/>
+      <w:r>
+        <w:t>querés</w:t>
+      </w:r>
+      <w:proofErr w:type="spellEnd"/>
+      <w:r>
+        <w:t xml:space="preserve"> mantener la base de datos en </w:t>
+      </w:r>
+      <w:proofErr w:type="spellStart"/>
+      <w:proofErr w:type="gramStart"/>
+      <w:r>
+        <w:t>el</w:t>
+      </w:r>
+      <w:proofErr w:type="spellEnd"/>
+      <w:r>
+        <w:t xml:space="preserve"> .</w:t>
+      </w:r>
+      <w:proofErr w:type="spellStart"/>
+      <w:r>
+        <w:t>gitignore</w:t>
+      </w:r>
+      <w:proofErr w:type="spellEnd"/>
+      <w:proofErr w:type="gramEnd"/>
+      <w:r>
+        <w:t xml:space="preserve"> por </w:t>
+      </w:r>
+      <w:proofErr w:type="gramStart"/>
+      <w:r>
+        <w:t>seguridad</w:t>
+      </w:r>
+      <w:proofErr w:type="gramEnd"/>
+      <w:r>
+        <w:t xml:space="preserve"> pero guardar todo el texto que cargaste en el Admin, </w:t>
+      </w:r>
+      <w:proofErr w:type="spellStart"/>
+      <w:r>
+        <w:t>podés</w:t>
+      </w:r>
+      <w:proofErr w:type="spellEnd"/>
+      <w:r>
+        <w:t xml:space="preserve"> volcar los datos a un </w:t>
+      </w:r>
+      <w:proofErr w:type="gramStart"/>
+      <w:r>
+        <w:t>archivo .</w:t>
+      </w:r>
+      <w:proofErr w:type="spellStart"/>
+      <w:r>
+        <w:t>json</w:t>
+      </w:r>
+      <w:proofErr w:type="spellEnd"/>
+      <w:proofErr w:type="gramEnd"/>
+      <w:r>
+        <w:t>:</w:t>
+      </w:r>
+    </w:p>
+    <w:p>
+      <w:pPr>
+        <w:numPr>
+          <w:ilvl w:val="0"/>
+          <w:numId w:val="6"/>
+        </w:numPr>
+      </w:pPr>
+      <w:r>
+        <w:t>Ejecuta en la terminal:</w:t>
+      </w:r>
+    </w:p>
+    <w:p>
+      <w:r>
+        <w:t>Bash</w:t>
+      </w:r>
+    </w:p>
+    <w:p>
+      <w:proofErr w:type="spellStart"/>
+      <w:r>
+        <w:t>python</w:t>
+      </w:r>
+      <w:proofErr w:type="spellEnd"/>
+      <w:r>
+        <w:t xml:space="preserve"> manage.py </w:t>
+      </w:r>
+      <w:proofErr w:type="spellStart"/>
+      <w:r>
+        <w:t>dumpdata</w:t>
+      </w:r>
+      <w:proofErr w:type="spellEnd"/>
+      <w:r>
+        <w:t xml:space="preserve"> --</w:t>
+      </w:r>
+      <w:proofErr w:type="spellStart"/>
+      <w:r>
+        <w:t>indent</w:t>
+      </w:r>
+      <w:proofErr w:type="spellEnd"/>
+      <w:r>
+        <w:t xml:space="preserve"> 4 &gt; </w:t>
+      </w:r>
+      <w:proofErr w:type="spellStart"/>
+      <w:proofErr w:type="gramStart"/>
+      <w:r>
+        <w:t>lecciones.json</w:t>
+      </w:r>
+      <w:proofErr w:type="spellEnd"/>
+      <w:proofErr w:type="gramEnd"/>
+    </w:p>
+    <w:p>
+      <w:pPr>
+        <w:numPr>
+          <w:ilvl w:val="0"/>
+          <w:numId w:val="6"/>
+        </w:numPr>
+      </w:pPr>
+      <w:r>
+        <w:lastRenderedPageBreak/>
+        <w:t xml:space="preserve">Como los </w:t>
+      </w:r>
+      <w:proofErr w:type="gramStart"/>
+      <w:r>
+        <w:t>archivos .</w:t>
+      </w:r>
+      <w:proofErr w:type="spellStart"/>
+      <w:r>
+        <w:t>json</w:t>
+      </w:r>
+      <w:proofErr w:type="spellEnd"/>
+      <w:proofErr w:type="gramEnd"/>
+      <w:r>
+        <w:t xml:space="preserve"> no están en </w:t>
+      </w:r>
+      <w:proofErr w:type="spellStart"/>
+      <w:proofErr w:type="gramStart"/>
+      <w:r>
+        <w:t>el</w:t>
+      </w:r>
+      <w:proofErr w:type="spellEnd"/>
+      <w:r>
+        <w:t xml:space="preserve"> .</w:t>
+      </w:r>
+      <w:proofErr w:type="spellStart"/>
+      <w:r>
+        <w:t>gitignore</w:t>
+      </w:r>
+      <w:proofErr w:type="spellEnd"/>
+      <w:proofErr w:type="gramEnd"/>
+      <w:r>
+        <w:t>, Git sí lo va a detectar. Guarda los cambios con:</w:t>
+      </w:r>
+    </w:p>
+    <w:p>
+      <w:r>
+        <w:t>Bash</w:t>
+      </w:r>
+    </w:p>
+    <w:p>
+      <w:proofErr w:type="spellStart"/>
+      <w:r>
+        <w:t>git</w:t>
+      </w:r>
+      <w:proofErr w:type="spellEnd"/>
+      <w:r>
+        <w:t xml:space="preserve"> </w:t>
+      </w:r>
+      <w:proofErr w:type="spellStart"/>
+      <w:r>
+        <w:t>add</w:t>
+      </w:r>
+      <w:proofErr w:type="spellEnd"/>
+      <w:r>
+        <w:t xml:space="preserve"> </w:t>
+      </w:r>
+      <w:proofErr w:type="spellStart"/>
+      <w:proofErr w:type="gramStart"/>
+      <w:r>
+        <w:t>lecciones.json</w:t>
+      </w:r>
+      <w:proofErr w:type="spellEnd"/>
+      <w:proofErr w:type="gramEnd"/>
+    </w:p>
+    <w:p>
+      <w:proofErr w:type="spellStart"/>
+      <w:r>
+        <w:t>git</w:t>
+      </w:r>
+      <w:proofErr w:type="spellEnd"/>
+      <w:r>
+        <w:t xml:space="preserve"> </w:t>
+      </w:r>
+      <w:proofErr w:type="spellStart"/>
+      <w:r>
+        <w:t>commit</w:t>
+      </w:r>
+      <w:proofErr w:type="spellEnd"/>
+      <w:r>
+        <w:t xml:space="preserve"> -m "Respaldo de contenido de lecciones en JSON"</w:t>
+      </w:r>
+    </w:p>
+    <w:p>
+      <w:r>
+        <w:rPr>
+          <w:i/>
+          <w:iCs/>
+        </w:rPr>
+        <w:t xml:space="preserve">(Si algún día abrís el proyecto en otra PC con una base de datos vacía, solo </w:t>
+      </w:r>
+      <w:proofErr w:type="spellStart"/>
+      <w:r>
+        <w:rPr>
+          <w:i/>
+          <w:iCs/>
+        </w:rPr>
+        <w:t>ejecutás</w:t>
+      </w:r>
+      <w:proofErr w:type="spellEnd"/>
+      <w:r>
+        <w:rPr>
+          <w:i/>
+          <w:iCs/>
+        </w:rPr>
+        <w:t xml:space="preserve"> </w:t>
+      </w:r>
+      <w:proofErr w:type="spellStart"/>
+      <w:r>
+        <w:rPr>
+          <w:i/>
+          <w:iCs/>
+        </w:rPr>
+        <w:t>python</w:t>
+      </w:r>
+      <w:proofErr w:type="spellEnd"/>
+      <w:r>
+        <w:rPr>
+          <w:i/>
+          <w:iCs/>
+        </w:rPr>
+        <w:t xml:space="preserve"> manage.py </w:t>
+      </w:r>
+      <w:proofErr w:type="spellStart"/>
+      <w:r>
+        <w:rPr>
+          <w:i/>
+          <w:iCs/>
+        </w:rPr>
+        <w:t>loaddata</w:t>
+      </w:r>
+      <w:proofErr w:type="spellEnd"/>
+      <w:r>
+        <w:rPr>
+          <w:i/>
+          <w:iCs/>
+        </w:rPr>
+        <w:t xml:space="preserve"> </w:t>
+      </w:r>
+      <w:proofErr w:type="spellStart"/>
+      <w:proofErr w:type="gramStart"/>
+      <w:r>
+        <w:rPr>
+          <w:i/>
+          <w:iCs/>
+        </w:rPr>
+        <w:t>lecciones.json</w:t>
+      </w:r>
+      <w:proofErr w:type="spellEnd"/>
+      <w:proofErr w:type="gramEnd"/>
+      <w:r>
+        <w:rPr>
+          <w:i/>
+          <w:iCs/>
+        </w:rPr>
+        <w:t xml:space="preserve"> y se te vuelve a cargar todo automáticamente).</w:t>
       </w:r>
     </w:p>
     <w:p/>
@@ -1402,6 +2069,119 @@
     </w:lvl>
   </w:abstractNum>
   <w:abstractNum w:abstractNumId="2" w15:restartNumberingAfterBreak="0">
+    <w:nsid w:val="3E3B23A5"/>
+    <w:multiLevelType w:val="multilevel"/>
+    <w:tmpl w:val="2D800FCC"/>
+    <w:lvl w:ilvl="0">
+      <w:start w:val="1"/>
+      <w:numFmt w:val="decimal"/>
+      <w:lvlText w:val="%1."/>
+      <w:lvlJc w:val="left"/>
+      <w:pPr>
+        <w:tabs>
+          <w:tab w:val="num" w:pos="720"/>
+        </w:tabs>
+        <w:ind w:left="720" w:hanging="360"/>
+      </w:pPr>
+    </w:lvl>
+    <w:lvl w:ilvl="1" w:tentative="1">
+      <w:start w:val="1"/>
+      <w:numFmt w:val="decimal"/>
+      <w:lvlText w:val="%2."/>
+      <w:lvlJc w:val="left"/>
+      <w:pPr>
+        <w:tabs>
+          <w:tab w:val="num" w:pos="1440"/>
+        </w:tabs>
+        <w:ind w:left="1440" w:hanging="360"/>
+      </w:pPr>
+    </w:lvl>
+    <w:lvl w:ilvl="2" w:tentative="1">
+      <w:start w:val="1"/>
+      <w:numFmt w:val="decimal"/>
+      <w:lvlText w:val="%3."/>
+      <w:lvlJc w:val="left"/>
+      <w:pPr>
+        <w:tabs>
+          <w:tab w:val="num" w:pos="2160"/>
+        </w:tabs>
+        <w:ind w:left="2160" w:hanging="360"/>
+      </w:pPr>
+    </w:lvl>
+    <w:lvl w:ilvl="3" w:tentative="1">
+      <w:start w:val="1"/>
+      <w:numFmt w:val="decimal"/>
+      <w:lvlText w:val="%4."/>
+      <w:lvlJc w:val="left"/>
+      <w:pPr>
+        <w:tabs>
+          <w:tab w:val="num" w:pos="2880"/>
+        </w:tabs>
+        <w:ind w:left="2880" w:hanging="360"/>
+      </w:pPr>
+    </w:lvl>
+    <w:lvl w:ilvl="4" w:tentative="1">
+      <w:start w:val="1"/>
+      <w:numFmt w:val="decimal"/>
+      <w:lvlText w:val="%5."/>
+      <w:lvlJc w:val="left"/>
+      <w:pPr>
+        <w:tabs>
+          <w:tab w:val="num" w:pos="3600"/>
+        </w:tabs>
+        <w:ind w:left="3600" w:hanging="360"/>
+      </w:pPr>
+    </w:lvl>
+    <w:lvl w:ilvl="5" w:tentative="1">
+      <w:start w:val="1"/>
+      <w:numFmt w:val="decimal"/>
+      <w:lvlText w:val="%6."/>
+      <w:lvlJc w:val="left"/>
+      <w:pPr>
+        <w:tabs>
+          <w:tab w:val="num" w:pos="4320"/>
+        </w:tabs>
+        <w:ind w:left="4320" w:hanging="360"/>
+      </w:pPr>
+    </w:lvl>
+    <w:lvl w:ilvl="6" w:tentative="1">
+      <w:start w:val="1"/>
+      <w:numFmt w:val="decimal"/>
+      <w:lvlText w:val="%7."/>
+      <w:lvlJc w:val="left"/>
+      <w:pPr>
+        <w:tabs>
+          <w:tab w:val="num" w:pos="5040"/>
+        </w:tabs>
+        <w:ind w:left="5040" w:hanging="360"/>
+      </w:pPr>
+    </w:lvl>
+    <w:lvl w:ilvl="7" w:tentative="1">
+      <w:start w:val="1"/>
+      <w:numFmt w:val="decimal"/>
+      <w:lvlText w:val="%8."/>
+      <w:lvlJc w:val="left"/>
+      <w:pPr>
+        <w:tabs>
+          <w:tab w:val="num" w:pos="5760"/>
+        </w:tabs>
+        <w:ind w:left="5760" w:hanging="360"/>
+      </w:pPr>
+    </w:lvl>
+    <w:lvl w:ilvl="8" w:tentative="1">
+      <w:start w:val="1"/>
+      <w:numFmt w:val="decimal"/>
+      <w:lvlText w:val="%9."/>
+      <w:lvlJc w:val="left"/>
+      <w:pPr>
+        <w:tabs>
+          <w:tab w:val="num" w:pos="6480"/>
+        </w:tabs>
+        <w:ind w:left="6480" w:hanging="360"/>
+      </w:pPr>
+    </w:lvl>
+  </w:abstractNum>
+  <w:abstractNum w:abstractNumId="3" w15:restartNumberingAfterBreak="0">
     <w:nsid w:val="4F0F47C5"/>
     <w:multiLevelType w:val="multilevel"/>
     <w:tmpl w:val="2F34243E"/>
@@ -1514,7 +2294,120 @@
       </w:pPr>
     </w:lvl>
   </w:abstractNum>
-  <w:abstractNum w:abstractNumId="3" w15:restartNumberingAfterBreak="0">
+  <w:abstractNum w:abstractNumId="4" w15:restartNumberingAfterBreak="0">
+    <w:nsid w:val="669D5C1F"/>
+    <w:multiLevelType w:val="multilevel"/>
+    <w:tmpl w:val="B898434E"/>
+    <w:lvl w:ilvl="0">
+      <w:start w:val="1"/>
+      <w:numFmt w:val="decimal"/>
+      <w:lvlText w:val="%1."/>
+      <w:lvlJc w:val="left"/>
+      <w:pPr>
+        <w:tabs>
+          <w:tab w:val="num" w:pos="720"/>
+        </w:tabs>
+        <w:ind w:left="720" w:hanging="360"/>
+      </w:pPr>
+    </w:lvl>
+    <w:lvl w:ilvl="1" w:tentative="1">
+      <w:start w:val="1"/>
+      <w:numFmt w:val="decimal"/>
+      <w:lvlText w:val="%2."/>
+      <w:lvlJc w:val="left"/>
+      <w:pPr>
+        <w:tabs>
+          <w:tab w:val="num" w:pos="1440"/>
+        </w:tabs>
+        <w:ind w:left="1440" w:hanging="360"/>
+      </w:pPr>
+    </w:lvl>
+    <w:lvl w:ilvl="2" w:tentative="1">
+      <w:start w:val="1"/>
+      <w:numFmt w:val="decimal"/>
+      <w:lvlText w:val="%3."/>
+      <w:lvlJc w:val="left"/>
+      <w:pPr>
+        <w:tabs>
+          <w:tab w:val="num" w:pos="2160"/>
+        </w:tabs>
+        <w:ind w:left="2160" w:hanging="360"/>
+      </w:pPr>
+    </w:lvl>
+    <w:lvl w:ilvl="3" w:tentative="1">
+      <w:start w:val="1"/>
+      <w:numFmt w:val="decimal"/>
+      <w:lvlText w:val="%4."/>
+      <w:lvlJc w:val="left"/>
+      <w:pPr>
+        <w:tabs>
+          <w:tab w:val="num" w:pos="2880"/>
+        </w:tabs>
+        <w:ind w:left="2880" w:hanging="360"/>
+      </w:pPr>
+    </w:lvl>
+    <w:lvl w:ilvl="4" w:tentative="1">
+      <w:start w:val="1"/>
+      <w:numFmt w:val="decimal"/>
+      <w:lvlText w:val="%5."/>
+      <w:lvlJc w:val="left"/>
+      <w:pPr>
+        <w:tabs>
+          <w:tab w:val="num" w:pos="3600"/>
+        </w:tabs>
+        <w:ind w:left="3600" w:hanging="360"/>
+      </w:pPr>
+    </w:lvl>
+    <w:lvl w:ilvl="5" w:tentative="1">
+      <w:start w:val="1"/>
+      <w:numFmt w:val="decimal"/>
+      <w:lvlText w:val="%6."/>
+      <w:lvlJc w:val="left"/>
+      <w:pPr>
+        <w:tabs>
+          <w:tab w:val="num" w:pos="4320"/>
+        </w:tabs>
+        <w:ind w:left="4320" w:hanging="360"/>
+      </w:pPr>
+    </w:lvl>
+    <w:lvl w:ilvl="6" w:tentative="1">
+      <w:start w:val="1"/>
+      <w:numFmt w:val="decimal"/>
+      <w:lvlText w:val="%7."/>
+      <w:lvlJc w:val="left"/>
+      <w:pPr>
+        <w:tabs>
+          <w:tab w:val="num" w:pos="5040"/>
+        </w:tabs>
+        <w:ind w:left="5040" w:hanging="360"/>
+      </w:pPr>
+    </w:lvl>
+    <w:lvl w:ilvl="7" w:tentative="1">
+      <w:start w:val="1"/>
+      <w:numFmt w:val="decimal"/>
+      <w:lvlText w:val="%8."/>
+      <w:lvlJc w:val="left"/>
+      <w:pPr>
+        <w:tabs>
+          <w:tab w:val="num" w:pos="5760"/>
+        </w:tabs>
+        <w:ind w:left="5760" w:hanging="360"/>
+      </w:pPr>
+    </w:lvl>
+    <w:lvl w:ilvl="8" w:tentative="1">
+      <w:start w:val="1"/>
+      <w:numFmt w:val="decimal"/>
+      <w:lvlText w:val="%9."/>
+      <w:lvlJc w:val="left"/>
+      <w:pPr>
+        <w:tabs>
+          <w:tab w:val="num" w:pos="6480"/>
+        </w:tabs>
+        <w:ind w:left="6480" w:hanging="360"/>
+      </w:pPr>
+    </w:lvl>
+  </w:abstractNum>
+  <w:abstractNum w:abstractNumId="5" w15:restartNumberingAfterBreak="0">
     <w:nsid w:val="68BA72B7"/>
     <w:multiLevelType w:val="multilevel"/>
     <w:tmpl w:val="33E2DBAC"/>
@@ -1670,10 +2563,16 @@
     <w:abstractNumId w:val="0"/>
   </w:num>
   <w:num w:numId="3" w16cid:durableId="1513833518">
-    <w:abstractNumId w:val="2"/>
+    <w:abstractNumId w:val="3"/>
   </w:num>
   <w:num w:numId="4" w16cid:durableId="1728603939">
-    <w:abstractNumId w:val="3"/>
+    <w:abstractNumId w:val="5"/>
+  </w:num>
+  <w:num w:numId="5" w16cid:durableId="1327629076">
+    <w:abstractNumId w:val="4"/>
+  </w:num>
+  <w:num w:numId="6" w16cid:durableId="816993965">
+    <w:abstractNumId w:val="2"/>
   </w:num>
 </w:numbering>
 </file>

</xml_diff>